<commit_message>
fl, ib, pn ready for publishing
</commit_message>
<xml_diff>
--- a/lci-akzo-lotte-61463/LCI-61463-26-02-FL.docx
+++ b/lci-akzo-lotte-61463/LCI-61463-26-02-FL.docx
@@ -146,19 +146,20 @@
         </w:tblCellMar>
       </w:tblPr>
       <w:tblGrid>
-        <w:gridCol w:w="8550"/>
-        <w:gridCol w:w="1422"/>
+        <w:gridCol w:w="8282"/>
+        <w:gridCol w:w="1690"/>
       </w:tblGrid>
       <w:tr>
         <w:trPr/>
         <w:tc>
           <w:tcPr>
-            <w:tcW w:w="8550" w:type="dxa"/>
+            <w:tcW w:w="8282" w:type="dxa"/>
             <w:tcBorders/>
           </w:tcPr>
           <w:p>
             <w:pPr>
               <w:pStyle w:val="TableContents"/>
+              <w:ind w:hanging="0" w:start="0"/>
               <w:rPr/>
             </w:pPr>
             <w:r>
@@ -168,7 +169,7 @@
         </w:tc>
         <w:tc>
           <w:tcPr>
-            <w:tcW w:w="1422" w:type="dxa"/>
+            <w:tcW w:w="1690" w:type="dxa"/>
             <w:tcBorders/>
           </w:tcPr>
           <w:p>
@@ -189,7 +190,7 @@
                 <w:szCs w:val="20"/>
                 <w:u w:val="none"/>
               </w:rPr>
-              <w:t>April</w:t>
+              <w:t xml:space="preserve">April </w:t>
             </w:r>
             <w:r>
               <w:rPr>
@@ -198,7 +199,16 @@
                 <w:szCs w:val="20"/>
                 <w:u w:val="none"/>
               </w:rPr>
-              <w:t xml:space="preserve"> 8, 2026</w:t>
+              <w:t>20</w:t>
+            </w:r>
+            <w:r>
+              <w:rPr>
+                <w:color w:val="auto"/>
+                <w:sz w:val="20"/>
+                <w:szCs w:val="20"/>
+                <w:u w:val="none"/>
+              </w:rPr>
+              <w:t>, 2026</w:t>
             </w:r>
           </w:p>
           <w:p>
@@ -266,7 +276,7 @@
                 <w:szCs w:val="20"/>
                 <w:u w:val="none"/>
               </w:rPr>
-              <w:t>LCI-61463-26-01</w:t>
+              <w:t>LCI-AKZO-LCPL-61463-26-02</w:t>
             </w:r>
             <w:r>
               <w:rPr>
@@ -366,9 +376,6 @@
       </w:pPr>
       <w:r>
         <w:rPr>
-          <w:i w:val="false"/>
-          <w:caps w:val="false"/>
-          <w:smallCaps w:val="false"/>
           <w:color w:val="auto"/>
           <w:sz w:val="20"/>
           <w:szCs w:val="20"/>
@@ -402,85 +409,7 @@
           <w:szCs w:val="20"/>
           <w:u w:val="none"/>
         </w:rPr>
-        <w:t xml:space="preserve">Transmission </w:t>
-      </w:r>
-      <w:r>
-        <w:rPr>
-          <w:b/>
-          <w:bCs/>
-          <w:strike w:val="false"/>
-          <w:dstrike w:val="false"/>
-          <w:color w:val="auto"/>
-          <w:sz w:val="20"/>
-          <w:szCs w:val="20"/>
-          <w:u w:val="none"/>
-        </w:rPr>
-        <w:t>of Shares</w:t>
-      </w:r>
-      <w:r>
-        <w:rPr>
-          <w:b/>
-          <w:bCs/>
-          <w:strike w:val="false"/>
-          <w:dstrike w:val="false"/>
-          <w:color w:val="auto"/>
-          <w:sz w:val="20"/>
-          <w:szCs w:val="20"/>
-          <w:u w:val="none"/>
-        </w:rPr>
-        <w:t xml:space="preserve"> </w:t>
-      </w:r>
-      <w:r>
-        <w:rPr>
-          <w:b/>
-          <w:bCs/>
-          <w:strike w:val="false"/>
-          <w:dstrike w:val="false"/>
-          <w:color w:val="auto"/>
-          <w:sz w:val="20"/>
-          <w:szCs w:val="20"/>
-          <w:u w:val="none"/>
-        </w:rPr>
-        <w:t>of</w:t>
-      </w:r>
-      <w:r>
-        <w:rPr>
-          <w:b/>
-          <w:bCs/>
-          <w:strike w:val="false"/>
-          <w:dstrike w:val="false"/>
-          <w:color w:val="auto"/>
-          <w:sz w:val="20"/>
-          <w:szCs w:val="20"/>
-          <w:u w:val="none"/>
-        </w:rPr>
-        <w:t xml:space="preserve"> Late Mohammad Ayub Khan </w:t>
-      </w:r>
-      <w:r>
-        <w:rPr>
-          <w:b/>
-          <w:bCs/>
-          <w:strike w:val="false"/>
-          <w:dstrike w:val="false"/>
-          <w:color w:val="auto"/>
-          <w:sz w:val="20"/>
-          <w:szCs w:val="20"/>
-          <w:u w:val="none"/>
-        </w:rPr>
-        <w:t>against</w:t>
-      </w:r>
-      <w:r>
-        <w:rPr>
-          <w:b/>
-          <w:bCs/>
-          <w:strike w:val="false"/>
-          <w:dstrike w:val="false"/>
-          <w:color w:val="auto"/>
-          <w:sz w:val="20"/>
-          <w:szCs w:val="20"/>
-          <w:u w:val="none"/>
-        </w:rPr>
-        <w:t xml:space="preserve"> Folio #: </w:t>
+        <w:t xml:space="preserve">Transmission of Shares of Late Mohammad Ayub Khan against Folio #: </w:t>
       </w:r>
       <w:r>
         <w:rPr>
@@ -1142,33 +1071,7 @@
           <w:szCs w:val="20"/>
           <w:u w:val="none"/>
         </w:rPr>
-        <w:t xml:space="preserve">Hereby, the legal heirs sign and confirm in agreement with the distribution </w:t>
-      </w:r>
-      <w:r>
-        <w:rPr>
-          <w:b w:val="false"/>
-          <w:bCs w:val="false"/>
-          <w:strike w:val="false"/>
-          <w:dstrike w:val="false"/>
-          <w:color w:val="auto"/>
-          <w:sz w:val="20"/>
-          <w:szCs w:val="20"/>
-          <w:u w:val="none"/>
-        </w:rPr>
-        <w:t>ratio of 1/3 of Total</w:t>
-      </w:r>
-      <w:r>
-        <w:rPr>
-          <w:b w:val="false"/>
-          <w:bCs w:val="false"/>
-          <w:strike w:val="false"/>
-          <w:dstrike w:val="false"/>
-          <w:color w:val="auto"/>
-          <w:sz w:val="20"/>
-          <w:szCs w:val="20"/>
-          <w:u w:val="none"/>
-        </w:rPr>
-        <w:t xml:space="preserve"> of shares articulated in your letter. </w:t>
+        <w:t xml:space="preserve">Hereby, the legal heirs sign and confirm in agreement with the distribution ratio of 1/3 of Total of shares articulated in your letter. </w:t>
       </w:r>
     </w:p>
     <w:p>
@@ -1364,6 +1267,76 @@
               <w:t>Signature:</w:t>
             </w:r>
           </w:p>
+        </w:tc>
+      </w:tr>
+      <w:tr>
+        <w:trPr/>
+        <w:tc>
+          <w:tcPr>
+            <w:tcW w:w="2640" w:type="dxa"/>
+            <w:tcBorders/>
+          </w:tcPr>
+          <w:p>
+            <w:pPr>
+              <w:pStyle w:val="Default"/>
+              <w:tabs>
+                <w:tab w:val="clear" w:pos="720"/>
+                <w:tab w:val="left" w:pos="400" w:leader="none"/>
+              </w:tabs>
+              <w:bidi w:val="0"/>
+              <w:jc w:val="start"/>
+              <w:rPr>
+                <w:rFonts w:ascii="Calibri" w:hAnsi="Calibri"/>
+                <w:b/>
+                <w:bCs/>
+                <w:sz w:val="20"/>
+                <w:szCs w:val="20"/>
+              </w:rPr>
+            </w:pPr>
+            <w:r>
+              <w:rPr>
+                <w:b/>
+                <w:bCs/>
+                <w:sz w:val="20"/>
+                <w:szCs w:val="20"/>
+              </w:rPr>
+              <w:t>Raja Muhammad Anees Khan</w:t>
+            </w:r>
+          </w:p>
+        </w:tc>
+        <w:tc>
+          <w:tcPr>
+            <w:tcW w:w="3667" w:type="dxa"/>
+            <w:tcBorders/>
+          </w:tcPr>
+          <w:p>
+            <w:pPr>
+              <w:pStyle w:val="Default"/>
+              <w:tabs>
+                <w:tab w:val="clear" w:pos="720"/>
+                <w:tab w:val="left" w:pos="400" w:leader="none"/>
+              </w:tabs>
+              <w:bidi w:val="0"/>
+              <w:jc w:val="start"/>
+              <w:rPr>
+                <w:rFonts w:ascii="Calibri" w:hAnsi="Calibri"/>
+                <w:sz w:val="20"/>
+                <w:szCs w:val="20"/>
+              </w:rPr>
+            </w:pPr>
+            <w:r>
+              <w:rPr>
+                <w:sz w:val="20"/>
+                <w:szCs w:val="20"/>
+              </w:rPr>
+            </w:r>
+          </w:p>
+        </w:tc>
+        <w:tc>
+          <w:tcPr>
+            <w:tcW w:w="3668" w:type="dxa"/>
+            <w:tcBorders/>
+          </w:tcPr>
           <w:p>
             <w:pPr>
               <w:pStyle w:val="Default"/>
@@ -1419,120 +1392,6 @@
                 <w:sz w:val="20"/>
                 <w:szCs w:val="20"/>
               </w:rPr>
-              <w:t>Raja Muhammad Anees Khan</w:t>
-            </w:r>
-          </w:p>
-        </w:tc>
-        <w:tc>
-          <w:tcPr>
-            <w:tcW w:w="3667" w:type="dxa"/>
-            <w:tcBorders/>
-          </w:tcPr>
-          <w:p>
-            <w:pPr>
-              <w:pStyle w:val="Default"/>
-              <w:tabs>
-                <w:tab w:val="clear" w:pos="720"/>
-                <w:tab w:val="left" w:pos="400" w:leader="none"/>
-              </w:tabs>
-              <w:bidi w:val="0"/>
-              <w:jc w:val="start"/>
-              <w:rPr>
-                <w:rFonts w:ascii="Calibri" w:hAnsi="Calibri"/>
-                <w:sz w:val="20"/>
-                <w:szCs w:val="20"/>
-              </w:rPr>
-            </w:pPr>
-            <w:r>
-              <w:rPr>
-                <w:sz w:val="20"/>
-                <w:szCs w:val="20"/>
-              </w:rPr>
-            </w:r>
-          </w:p>
-        </w:tc>
-        <w:tc>
-          <w:tcPr>
-            <w:tcW w:w="3668" w:type="dxa"/>
-            <w:tcBorders/>
-          </w:tcPr>
-          <w:p>
-            <w:pPr>
-              <w:pStyle w:val="Default"/>
-              <w:tabs>
-                <w:tab w:val="clear" w:pos="720"/>
-                <w:tab w:val="left" w:pos="400" w:leader="none"/>
-              </w:tabs>
-              <w:bidi w:val="0"/>
-              <w:jc w:val="start"/>
-              <w:rPr>
-                <w:rFonts w:ascii="Calibri" w:hAnsi="Calibri"/>
-                <w:sz w:val="20"/>
-                <w:szCs w:val="20"/>
-              </w:rPr>
-            </w:pPr>
-            <w:r>
-              <w:rPr>
-                <w:sz w:val="20"/>
-                <w:szCs w:val="20"/>
-              </w:rPr>
-            </w:r>
-          </w:p>
-          <w:p>
-            <w:pPr>
-              <w:pStyle w:val="Default"/>
-              <w:tabs>
-                <w:tab w:val="clear" w:pos="720"/>
-                <w:tab w:val="left" w:pos="400" w:leader="none"/>
-              </w:tabs>
-              <w:bidi w:val="0"/>
-              <w:jc w:val="start"/>
-              <w:rPr>
-                <w:rFonts w:ascii="Calibri" w:hAnsi="Calibri"/>
-                <w:sz w:val="20"/>
-                <w:szCs w:val="20"/>
-              </w:rPr>
-            </w:pPr>
-            <w:r>
-              <w:rPr>
-                <w:sz w:val="20"/>
-                <w:szCs w:val="20"/>
-              </w:rPr>
-            </w:r>
-          </w:p>
-        </w:tc>
-      </w:tr>
-      <w:tr>
-        <w:trPr/>
-        <w:tc>
-          <w:tcPr>
-            <w:tcW w:w="2640" w:type="dxa"/>
-            <w:tcBorders/>
-          </w:tcPr>
-          <w:p>
-            <w:pPr>
-              <w:pStyle w:val="Default"/>
-              <w:tabs>
-                <w:tab w:val="clear" w:pos="720"/>
-                <w:tab w:val="left" w:pos="400" w:leader="none"/>
-              </w:tabs>
-              <w:bidi w:val="0"/>
-              <w:jc w:val="start"/>
-              <w:rPr>
-                <w:rFonts w:ascii="Calibri" w:hAnsi="Calibri"/>
-                <w:b/>
-                <w:bCs/>
-                <w:sz w:val="20"/>
-                <w:szCs w:val="20"/>
-              </w:rPr>
-            </w:pPr>
-            <w:r>
-              <w:rPr>
-                <w:b/>
-                <w:bCs/>
-                <w:sz w:val="20"/>
-                <w:szCs w:val="20"/>
-              </w:rPr>
               <w:t>Raja Muhammad Idrees Khan</w:t>
             </w:r>
           </w:p>
@@ -1592,28 +1451,6 @@
               </w:rPr>
             </w:r>
           </w:p>
-          <w:p>
-            <w:pPr>
-              <w:pStyle w:val="Default"/>
-              <w:tabs>
-                <w:tab w:val="clear" w:pos="720"/>
-                <w:tab w:val="left" w:pos="400" w:leader="none"/>
-              </w:tabs>
-              <w:bidi w:val="0"/>
-              <w:jc w:val="start"/>
-              <w:rPr>
-                <w:rFonts w:ascii="Calibri" w:hAnsi="Calibri"/>
-                <w:sz w:val="20"/>
-                <w:szCs w:val="20"/>
-              </w:rPr>
-            </w:pPr>
-            <w:r>
-              <w:rPr>
-                <w:sz w:val="20"/>
-                <w:szCs w:val="20"/>
-              </w:rPr>
-            </w:r>
-          </w:p>
         </w:tc>
       </w:tr>
     </w:tbl>
@@ -1722,7 +1559,7 @@
           <w:szCs w:val="20"/>
           <w:u w:val="none"/>
         </w:rPr>
-        <w:t>Revised Letter of Indemnity</w:t>
+        <w:t xml:space="preserve">Revised Letter of Indemnity on E-stamp paper of Rs.500/, as per the provided specimen, duly signed by </w:t>
       </w:r>
       <w:r>
         <w:rPr>
@@ -1735,7 +1572,7 @@
           <w:szCs w:val="20"/>
           <w:u w:val="none"/>
         </w:rPr>
-        <w:t xml:space="preserve"> on E-stamp paper of Rs.500/, as per the provided specimen, duly signed by one legal heir, </w:t>
+        <w:t>me, the undersigned</w:t>
       </w:r>
       <w:r>
         <w:rPr>
@@ -1748,20 +1585,7 @@
           <w:szCs w:val="20"/>
           <w:u w:val="none"/>
         </w:rPr>
-        <w:t xml:space="preserve">sureties, and </w:t>
-      </w:r>
-      <w:r>
-        <w:rPr>
-          <w:b w:val="false"/>
-          <w:bCs w:val="false"/>
-          <w:strike w:val="false"/>
-          <w:dstrike w:val="false"/>
-          <w:color w:val="auto"/>
-          <w:sz w:val="20"/>
-          <w:szCs w:val="20"/>
-          <w:u w:val="none"/>
-        </w:rPr>
-        <w:t>witnesses, and attested by Notary Public;</w:t>
+        <w:t>, sureties, and witnesses, and attested by Notary Public;</w:t>
       </w:r>
     </w:p>
     <w:p>
@@ -1800,33 +1624,7 @@
           <w:szCs w:val="20"/>
           <w:u w:val="none"/>
         </w:rPr>
-        <w:t>Legible copies of Computerized National Identity Cards (CNICs) of all the witness</w:t>
-      </w:r>
-      <w:r>
-        <w:rPr>
-          <w:b w:val="false"/>
-          <w:bCs w:val="false"/>
-          <w:strike w:val="false"/>
-          <w:dstrike w:val="false"/>
-          <w:color w:val="auto"/>
-          <w:sz w:val="20"/>
-          <w:szCs w:val="20"/>
-          <w:u w:val="none"/>
-        </w:rPr>
-        <w:t xml:space="preserve">es and sureties </w:t>
-      </w:r>
-      <w:r>
-        <w:rPr>
-          <w:b w:val="false"/>
-          <w:bCs w:val="false"/>
-          <w:strike w:val="false"/>
-          <w:dstrike w:val="false"/>
-          <w:color w:val="auto"/>
-          <w:sz w:val="20"/>
-          <w:szCs w:val="20"/>
-          <w:u w:val="none"/>
-        </w:rPr>
-        <w:t>attested by the Notary Public; and</w:t>
+        <w:t>Legible copies of Computerized National Identity Cards (CNICs) of all the witnesses and sureties attested by the Notary Public;</w:t>
       </w:r>
     </w:p>
     <w:p>
@@ -1904,7 +1702,46 @@
           <w:szCs w:val="20"/>
           <w:u w:val="none"/>
         </w:rPr>
-        <w:t>English: The Nation, dated, July 1, 2025, page number 4, column number 3.</w:t>
+        <w:t>English: The Nation, dated, July 1, 2025, page number 4, column number 3;</w:t>
+      </w:r>
+    </w:p>
+    <w:p>
+      <w:pPr>
+        <w:pStyle w:val="Default"/>
+        <w:numPr>
+          <w:ilvl w:val="0"/>
+          <w:numId w:val="4"/>
+        </w:numPr>
+        <w:tabs>
+          <w:tab w:val="clear" w:pos="720"/>
+          <w:tab w:val="left" w:pos="400" w:leader="none"/>
+        </w:tabs>
+        <w:bidi w:val="0"/>
+        <w:jc w:val="both"/>
+        <w:rPr>
+          <w:rFonts w:ascii="Calibri" w:hAnsi="Calibri"/>
+          <w:b w:val="false"/>
+          <w:bCs w:val="false"/>
+          <w:strike w:val="false"/>
+          <w:dstrike w:val="false"/>
+          <w:color w:val="auto"/>
+          <w:sz w:val="20"/>
+          <w:szCs w:val="20"/>
+          <w:u w:val="none"/>
+        </w:rPr>
+      </w:pPr>
+      <w:r>
+        <w:rPr>
+          <w:b w:val="false"/>
+          <w:bCs w:val="false"/>
+          <w:strike w:val="false"/>
+          <w:dstrike w:val="false"/>
+          <w:color w:val="auto"/>
+          <w:sz w:val="20"/>
+          <w:szCs w:val="20"/>
+          <w:u w:val="none"/>
+        </w:rPr>
+        <w:t>Clear copies of Cheques of all legal heirs.</w:t>
       </w:r>
     </w:p>
     <w:p>
@@ -2213,31 +2050,7 @@
                 <w:szCs w:val="20"/>
                 <w:u w:val="none"/>
               </w:rPr>
-              <w:t>21, Ghulam Nabi Colony</w:t>
-            </w:r>
-            <w:r>
-              <w:rPr>
-                <w:b w:val="false"/>
-                <w:strike w:val="false"/>
-                <w:dstrike w:val="false"/>
-                <w:color w:val="auto"/>
-                <w:sz w:val="20"/>
-                <w:szCs w:val="20"/>
-                <w:u w:val="none"/>
-              </w:rPr>
-              <w:t xml:space="preserve">, </w:t>
-            </w:r>
-            <w:r>
-              <w:rPr>
-                <w:b w:val="false"/>
-                <w:strike w:val="false"/>
-                <w:dstrike w:val="false"/>
-                <w:color w:val="auto"/>
-                <w:sz w:val="20"/>
-                <w:szCs w:val="20"/>
-                <w:u w:val="none"/>
-              </w:rPr>
-              <w:t>Samanabad, Lahore, 54500</w:t>
+              <w:t>21, Ghulam Nabi Colony, Samanabad, Lahore, 54500</w:t>
             </w:r>
           </w:p>
         </w:tc>
@@ -2510,7 +2323,7 @@
               <w:sz w:val="14"/>
               <w:szCs w:val="14"/>
             </w:rPr>
-            <w:t>LCI-61463-26-01</w:t>
+            <w:t>LCI-AKZO-LCPL-61463-26-02</w:t>
           </w:r>
           <w:r>
             <w:rPr>
@@ -2750,7 +2563,7 @@
               <w:sz w:val="14"/>
               <w:szCs w:val="14"/>
             </w:rPr>
-            <w:t>LCI-61463-26-01</w:t>
+            <w:t>LCI-AKZO-LCPL-61463-26-02</w:t>
           </w:r>
           <w:r>
             <w:rPr>

</xml_diff>